<commit_message>
fix: remove 重走长征路 namespace from docs, fix template titles
Root cause: Doxygen EXCLUDE uses space-delimited values, so
'005 代码备份/' was parsed as two entries ('005' and '代码备份/')
and the old V001 backup script was NOT excluded, creating an
erroneous '重走长征路' namespace.

Fixes:
- Rename 005 代码备份/ -> 005_代码备份/ (remove space)
- Update Doxyfile EXCLUDE paths accordingly
- Fix all HTML template titles (admin/*.html, login, register)
- Fix subtitle in login.html: 重走长征路 -> 我走长征路
- Fix README.md and user manual text references
- Add EXCLUDE_PATTERNS and EXCLUDE_SYMBOLS as safeguards
</commit_message>
<xml_diff>
--- a/010 学习资料/操作.docx
+++ b/010 学习资料/操作.docx
@@ -5,6 +5,7 @@
     <w:p>
       <w:pPr>
         <w:rPr>
+          <w:rFonts w:hint="eastAsia"/>
           <w:b/>
           <w:bCs/>
           <w:color w:val="FF0000"/>
@@ -36,6 +37,11 @@
     </w:p>
     <w:bookmarkStart w:id="0" w:name="OLE_LINK2"/>
     <w:p>
+      <w:pPr>
+        <w:rPr>
+          <w:rFonts w:hint="eastAsia"/>
+        </w:rPr>
+      </w:pPr>
       <w:r>
         <w:rPr>
           <w:b/>
@@ -77,11 +83,21 @@
     </w:p>
     <w:bookmarkEnd w:id="0"/>
     <w:p>
+      <w:pPr>
+        <w:rPr>
+          <w:rFonts w:hint="eastAsia"/>
+        </w:rPr>
+      </w:pPr>
       <w:r>
         <w:t>现在另一台机器的浏览器打开这个地址就能访问长征数字地图了。</w:t>
       </w:r>
     </w:p>
     <w:p>
+      <w:pPr>
+        <w:rPr>
+          <w:rFonts w:hint="eastAsia"/>
+        </w:rPr>
+      </w:pPr>
       <w:r>
         <w:rPr>
           <w:rFonts w:ascii="Segoe UI Symbol" w:hAnsi="Segoe UI Symbol" w:cs="Segoe UI Symbol"/>
@@ -119,16 +135,31 @@
       </w:r>
     </w:p>
     <w:p>
+      <w:pPr>
+        <w:rPr>
+          <w:rFonts w:hint="eastAsia"/>
+        </w:rPr>
+      </w:pPr>
       <w:r>
         <w:t>如果隧道停了（关掉命令行窗口后），重新跑：</w:t>
       </w:r>
     </w:p>
     <w:p>
+      <w:pPr>
+        <w:rPr>
+          <w:rFonts w:hint="eastAsia"/>
+        </w:rPr>
+      </w:pPr>
       <w:r>
         <w:t>复制</w:t>
       </w:r>
     </w:p>
     <w:p>
+      <w:pPr>
+        <w:rPr>
+          <w:rFonts w:hint="eastAsia"/>
+        </w:rPr>
+      </w:pPr>
       <w:proofErr w:type="spellStart"/>
       <w:r>
         <w:t>npx</w:t>
@@ -147,13 +178,36 @@
       </w:r>
     </w:p>
     <w:p>
+      <w:pPr>
+        <w:rPr>
+          <w:rFonts w:hint="eastAsia"/>
+        </w:rPr>
+      </w:pPr>
       <w:r>
         <w:t>它会重新生成一个新地址。</w:t>
       </w:r>
     </w:p>
-    <w:p/>
-    <w:p/>
-    <w:p/>
+    <w:p>
+      <w:pPr>
+        <w:rPr>
+          <w:rFonts w:hint="eastAsia"/>
+        </w:rPr>
+      </w:pPr>
+    </w:p>
+    <w:p>
+      <w:pPr>
+        <w:rPr>
+          <w:rFonts w:hint="eastAsia"/>
+        </w:rPr>
+      </w:pPr>
+    </w:p>
+    <w:p>
+      <w:pPr>
+        <w:rPr>
+          <w:rFonts w:hint="eastAsia"/>
+        </w:rPr>
+      </w:pPr>
+    </w:p>
     <w:p>
       <w:pPr>
         <w:rPr>
@@ -178,7 +232,27 @@
         <w:rPr>
           <w:rFonts w:hint="eastAsia"/>
         </w:rPr>
-        <w:t xml:space="preserve">路由全部注册、数据库 7 张表创建完毕、10 </w:t>
+        <w:t>路由全部注册、数据库 7 张表创建完毕、10 个节点数据导入成功、管理员账号可用。</w:t>
+      </w:r>
+    </w:p>
+    <w:p>
+      <w:pPr>
+        <w:rPr>
+          <w:rFonts w:hint="eastAsia"/>
+        </w:rPr>
+      </w:pPr>
+    </w:p>
+    <w:p>
+      <w:pPr>
+        <w:rPr>
+          <w:rFonts w:hint="eastAsia"/>
+        </w:rPr>
+      </w:pPr>
+      <w:r>
+        <w:rPr>
+          <w:rFonts w:hint="eastAsia"/>
+        </w:rPr>
+        <w:t xml:space="preserve">**项目代码生成完成！** 共 41 </w:t>
       </w:r>
       <w:proofErr w:type="gramStart"/>
       <w:r>
@@ -192,121 +266,441 @@
         <w:rPr>
           <w:rFonts w:hint="eastAsia"/>
         </w:rPr>
-        <w:t>节点数据导入成功、管理员账号可用。</w:t>
-      </w:r>
-    </w:p>
-    <w:p>
-      <w:pPr>
-        <w:rPr>
-          <w:rFonts w:hint="eastAsia"/>
-        </w:rPr>
-      </w:pPr>
-    </w:p>
-    <w:p>
-      <w:pPr>
-        <w:rPr>
-          <w:rFonts w:hint="eastAsia"/>
-        </w:rPr>
-      </w:pPr>
-      <w:r>
-        <w:rPr>
-          <w:rFonts w:hint="eastAsia"/>
-        </w:rPr>
-        <w:t xml:space="preserve">**项目代码生成完成！** 共 41 </w:t>
+        <w:t>文件，位于 `D:\长征文化\001 项目源码\`</w:t>
+      </w:r>
+    </w:p>
+    <w:p>
+      <w:pPr>
+        <w:rPr>
+          <w:rFonts w:hint="eastAsia"/>
+        </w:rPr>
+      </w:pPr>
+    </w:p>
+    <w:p>
+      <w:pPr>
+        <w:rPr>
+          <w:rFonts w:hint="eastAsia"/>
+        </w:rPr>
+      </w:pPr>
+      <w:r>
+        <w:rPr>
+          <w:rFonts w:hint="eastAsia"/>
+        </w:rPr>
+        <w:t>### 启动方式</w:t>
+      </w:r>
+    </w:p>
+    <w:p>
+      <w:pPr>
+        <w:rPr>
+          <w:rFonts w:hint="eastAsia"/>
+        </w:rPr>
+      </w:pPr>
+    </w:p>
+    <w:p>
+      <w:pPr>
+        <w:rPr>
+          <w:rFonts w:hint="eastAsia"/>
+        </w:rPr>
+      </w:pPr>
+      <w:r>
+        <w:rPr>
+          <w:rFonts w:hint="eastAsia"/>
+        </w:rPr>
+        <w:t>```bash</w:t>
+      </w:r>
+    </w:p>
+    <w:p>
+      <w:pPr>
+        <w:rPr>
+          <w:rFonts w:hint="eastAsia"/>
+        </w:rPr>
+      </w:pPr>
+      <w:r>
+        <w:rPr>
+          <w:rFonts w:hint="eastAsia"/>
+        </w:rPr>
+        <w:t>cd "D:\长征文化\001 项目源码"</w:t>
+      </w:r>
+    </w:p>
+    <w:p>
+      <w:pPr>
+        <w:rPr>
+          <w:rFonts w:hint="eastAsia"/>
+        </w:rPr>
+      </w:pPr>
+      <w:r>
+        <w:rPr>
+          <w:rFonts w:hint="eastAsia"/>
+        </w:rPr>
+        <w:t>pip install Flask</w:t>
+      </w:r>
+    </w:p>
+    <w:p>
+      <w:pPr>
+        <w:rPr>
+          <w:rFonts w:hint="eastAsia"/>
+        </w:rPr>
+      </w:pPr>
+      <w:r>
+        <w:rPr>
+          <w:rFonts w:hint="eastAsia"/>
+        </w:rPr>
+        <w:t>python run.py</w:t>
+      </w:r>
+    </w:p>
+    <w:p>
+      <w:pPr>
+        <w:rPr>
+          <w:rFonts w:hint="eastAsia"/>
+        </w:rPr>
+      </w:pPr>
+      <w:r>
+        <w:rPr>
+          <w:rFonts w:hint="eastAsia"/>
+        </w:rPr>
+        <w:t>```</w:t>
+      </w:r>
+    </w:p>
+    <w:p>
+      <w:pPr>
+        <w:rPr>
+          <w:rFonts w:hint="eastAsia"/>
+        </w:rPr>
+      </w:pPr>
+    </w:p>
+    <w:p>
+      <w:pPr>
+        <w:rPr>
+          <w:rFonts w:hint="eastAsia"/>
+        </w:rPr>
+      </w:pPr>
+      <w:r>
+        <w:rPr>
+          <w:rFonts w:hint="eastAsia"/>
+        </w:rPr>
+        <w:t>访问 `</w:t>
+      </w:r>
+      <w:bookmarkStart w:id="1" w:name="OLE_LINK1"/>
+      <w:r>
+        <w:rPr>
+          <w:rFonts w:hint="eastAsia"/>
+        </w:rPr>
+        <w:t>http://127.0.0.1:5000</w:t>
+      </w:r>
+      <w:bookmarkEnd w:id="1"/>
+      <w:r>
+        <w:rPr>
+          <w:rFonts w:hint="eastAsia"/>
+        </w:rPr>
+        <w:t>` 即可看到全屏长征地图。</w:t>
+      </w:r>
+    </w:p>
+    <w:p>
+      <w:pPr>
+        <w:rPr>
+          <w:rFonts w:hint="eastAsia"/>
+        </w:rPr>
+      </w:pPr>
+    </w:p>
+    <w:p>
+      <w:pPr>
+        <w:rPr>
+          <w:rFonts w:hint="eastAsia"/>
+        </w:rPr>
+      </w:pPr>
+      <w:r>
+        <w:rPr>
+          <w:rFonts w:hint="eastAsia"/>
+        </w:rPr>
+        <w:t>### 验证结果</w:t>
+      </w:r>
+    </w:p>
+    <w:p>
+      <w:pPr>
+        <w:rPr>
+          <w:rFonts w:hint="eastAsia"/>
+        </w:rPr>
+      </w:pPr>
+    </w:p>
+    <w:p>
+      <w:pPr>
+        <w:rPr>
+          <w:rFonts w:hint="eastAsia"/>
+        </w:rPr>
+      </w:pPr>
+      <w:r>
+        <w:rPr>
+          <w:rFonts w:hint="eastAsia"/>
+        </w:rPr>
+        <w:t>| 项目 | 状态 |</w:t>
+      </w:r>
+    </w:p>
+    <w:p>
+      <w:pPr>
+        <w:rPr>
+          <w:rFonts w:hint="eastAsia"/>
+        </w:rPr>
+      </w:pPr>
+      <w:r>
+        <w:rPr>
+          <w:rFonts w:hint="eastAsia"/>
+        </w:rPr>
+        <w:t>|------|------|</w:t>
+      </w:r>
+    </w:p>
+    <w:p>
+      <w:pPr>
+        <w:rPr>
+          <w:rFonts w:hint="eastAsia"/>
+        </w:rPr>
+      </w:pPr>
+      <w:r>
+        <w:t xml:space="preserve">| Flask 应用启动 | </w:t>
+      </w:r>
+      <w:r>
+        <w:rPr>
+          <w:rFonts w:ascii="Segoe UI Emoji" w:hAnsi="Segoe UI Emoji" w:cs="Segoe UI Emoji"/>
+        </w:rPr>
+        <w:t>✅</w:t>
+      </w:r>
+      <w:r>
+        <w:t xml:space="preserve"> 40 </w:t>
       </w:r>
       <w:proofErr w:type="gramStart"/>
       <w:r>
-        <w:rPr>
-          <w:rFonts w:hint="eastAsia"/>
-        </w:rPr>
         <w:t>个</w:t>
       </w:r>
       <w:proofErr w:type="gramEnd"/>
       <w:r>
-        <w:rPr>
-          <w:rFonts w:hint="eastAsia"/>
-        </w:rPr>
-        <w:t>文件，位于 `D:\长征文化\001 项目源码\`</w:t>
-      </w:r>
-    </w:p>
-    <w:p>
-      <w:pPr>
-        <w:rPr>
-          <w:rFonts w:hint="eastAsia"/>
-        </w:rPr>
-      </w:pPr>
-    </w:p>
-    <w:p>
-      <w:pPr>
-        <w:rPr>
-          <w:rFonts w:hint="eastAsia"/>
-        </w:rPr>
-      </w:pPr>
-      <w:r>
-        <w:rPr>
-          <w:rFonts w:hint="eastAsia"/>
-        </w:rPr>
-        <w:t>### 启动方式</w:t>
-      </w:r>
-    </w:p>
-    <w:p>
-      <w:pPr>
-        <w:rPr>
-          <w:rFonts w:hint="eastAsia"/>
-        </w:rPr>
-      </w:pPr>
-    </w:p>
-    <w:p>
-      <w:pPr>
-        <w:rPr>
-          <w:rFonts w:hint="eastAsia"/>
-        </w:rPr>
-      </w:pPr>
-      <w:r>
-        <w:rPr>
-          <w:rFonts w:hint="eastAsia"/>
-        </w:rPr>
-        <w:t>```bash</w:t>
-      </w:r>
-    </w:p>
-    <w:p>
-      <w:pPr>
-        <w:rPr>
-          <w:rFonts w:hint="eastAsia"/>
-        </w:rPr>
-      </w:pPr>
-      <w:r>
-        <w:rPr>
-          <w:rFonts w:hint="eastAsia"/>
-        </w:rPr>
-        <w:t>cd "D:\长征文化\001 项目源码"</w:t>
-      </w:r>
-    </w:p>
-    <w:p>
-      <w:pPr>
-        <w:rPr>
-          <w:rFonts w:hint="eastAsia"/>
-        </w:rPr>
-      </w:pPr>
-      <w:r>
-        <w:rPr>
-          <w:rFonts w:hint="eastAsia"/>
-        </w:rPr>
-        <w:t>pip install Flask</w:t>
-      </w:r>
-    </w:p>
-    <w:p>
-      <w:pPr>
-        <w:rPr>
-          <w:rFonts w:hint="eastAsia"/>
-        </w:rPr>
-      </w:pPr>
-      <w:r>
-        <w:rPr>
-          <w:rFonts w:hint="eastAsia"/>
-        </w:rPr>
-        <w:t>python run.py</w:t>
-      </w:r>
+        <w:t>路由注册成功 |</w:t>
+      </w:r>
+    </w:p>
+    <w:p>
+      <w:pPr>
+        <w:rPr>
+          <w:rFonts w:hint="eastAsia"/>
+        </w:rPr>
+      </w:pPr>
+      <w:r>
+        <w:t xml:space="preserve">| 数据库 7 张表 | </w:t>
+      </w:r>
+      <w:r>
+        <w:rPr>
+          <w:rFonts w:ascii="Segoe UI Emoji" w:hAnsi="Segoe UI Emoji" w:cs="Segoe UI Emoji"/>
+        </w:rPr>
+        <w:t>✅</w:t>
+      </w:r>
+      <w:r>
+        <w:t xml:space="preserve"> user/node/media/spark/comment/</w:t>
+      </w:r>
+      <w:proofErr w:type="spellStart"/>
+      <w:r>
+        <w:t>route_point</w:t>
+      </w:r>
+      <w:proofErr w:type="spellEnd"/>
+      <w:r>
+        <w:t xml:space="preserve"> |</w:t>
+      </w:r>
+    </w:p>
+    <w:p>
+      <w:pPr>
+        <w:rPr>
+          <w:rFonts w:hint="eastAsia"/>
+        </w:rPr>
+      </w:pPr>
+      <w:r>
+        <w:t xml:space="preserve">| 初始节点数据（10 </w:t>
+      </w:r>
+      <w:proofErr w:type="gramStart"/>
+      <w:r>
+        <w:t>个</w:t>
+      </w:r>
+      <w:proofErr w:type="gramEnd"/>
+      <w:r>
+        <w:t xml:space="preserve">） | </w:t>
+      </w:r>
+      <w:r>
+        <w:rPr>
+          <w:rFonts w:ascii="Segoe UI Emoji" w:hAnsi="Segoe UI Emoji" w:cs="Segoe UI Emoji"/>
+        </w:rPr>
+        <w:t>✅</w:t>
+      </w:r>
+      <w:r>
+        <w:t xml:space="preserve"> 瑞金→遵义→赤水→泸定→雪山→草地→会宁 |</w:t>
+      </w:r>
+    </w:p>
+    <w:p>
+      <w:pPr>
+        <w:rPr>
+          <w:rFonts w:hint="eastAsia"/>
+        </w:rPr>
+      </w:pPr>
+      <w:r>
+        <w:t xml:space="preserve">| 管理员账号 | </w:t>
+      </w:r>
+      <w:r>
+        <w:rPr>
+          <w:rFonts w:ascii="Segoe UI Emoji" w:hAnsi="Segoe UI Emoji" w:cs="Segoe UI Emoji"/>
+        </w:rPr>
+        <w:t>✅</w:t>
+      </w:r>
+      <w:r>
+        <w:t xml:space="preserve"> admin / admin123 |</w:t>
+      </w:r>
+    </w:p>
+    <w:p>
+      <w:pPr>
+        <w:rPr>
+          <w:rFonts w:hint="eastAsia"/>
+        </w:rPr>
+      </w:pPr>
+      <w:r>
+        <w:t>| /</w:t>
+      </w:r>
+      <w:proofErr w:type="spellStart"/>
+      <w:r>
+        <w:t>api</w:t>
+      </w:r>
+      <w:proofErr w:type="spellEnd"/>
+      <w:r>
+        <w:t xml:space="preserve">/v1/nodes | </w:t>
+      </w:r>
+      <w:r>
+        <w:rPr>
+          <w:rFonts w:ascii="Segoe UI Emoji" w:hAnsi="Segoe UI Emoji" w:cs="Segoe UI Emoji"/>
+        </w:rPr>
+        <w:t>✅</w:t>
+      </w:r>
+      <w:r>
+        <w:t xml:space="preserve"> 分页查询 OK |</w:t>
+      </w:r>
+    </w:p>
+    <w:p>
+      <w:pPr>
+        <w:rPr>
+          <w:rFonts w:hint="eastAsia"/>
+        </w:rPr>
+      </w:pPr>
+      <w:r>
+        <w:t>| /</w:t>
+      </w:r>
+      <w:proofErr w:type="spellStart"/>
+      <w:r>
+        <w:t>api</w:t>
+      </w:r>
+      <w:proofErr w:type="spellEnd"/>
+      <w:r>
+        <w:t xml:space="preserve">/v1/nodes/001 | </w:t>
+      </w:r>
+      <w:r>
+        <w:rPr>
+          <w:rFonts w:ascii="Segoe UI Emoji" w:hAnsi="Segoe UI Emoji" w:cs="Segoe UI Emoji"/>
+        </w:rPr>
+        <w:t>✅</w:t>
+      </w:r>
+      <w:r>
+        <w:t xml:space="preserve"> 瑞金详情返回 |</w:t>
+      </w:r>
+    </w:p>
+    <w:p>
+      <w:pPr>
+        <w:rPr>
+          <w:rFonts w:hint="eastAsia"/>
+        </w:rPr>
+      </w:pPr>
+      <w:r>
+        <w:t>| /</w:t>
+      </w:r>
+      <w:proofErr w:type="spellStart"/>
+      <w:r>
+        <w:t>api</w:t>
+      </w:r>
+      <w:proofErr w:type="spellEnd"/>
+      <w:r>
+        <w:t xml:space="preserve">/v1/auth/login | </w:t>
+      </w:r>
+      <w:r>
+        <w:rPr>
+          <w:rFonts w:ascii="Segoe UI Emoji" w:hAnsi="Segoe UI Emoji" w:cs="Segoe UI Emoji"/>
+        </w:rPr>
+        <w:t>✅</w:t>
+      </w:r>
+      <w:r>
+        <w:t xml:space="preserve"> JWT 令牌生成 |</w:t>
+      </w:r>
+    </w:p>
+    <w:p>
+      <w:pPr>
+        <w:rPr>
+          <w:rFonts w:hint="eastAsia"/>
+        </w:rPr>
+      </w:pPr>
+      <w:r>
+        <w:t>| /</w:t>
+      </w:r>
+      <w:proofErr w:type="spellStart"/>
+      <w:r>
+        <w:t>api</w:t>
+      </w:r>
+      <w:proofErr w:type="spellEnd"/>
+      <w:r>
+        <w:t xml:space="preserve">/v1/sparks | </w:t>
+      </w:r>
+      <w:r>
+        <w:rPr>
+          <w:rFonts w:ascii="Segoe UI Emoji" w:hAnsi="Segoe UI Emoji" w:cs="Segoe UI Emoji"/>
+        </w:rPr>
+        <w:t>✅</w:t>
+      </w:r>
+      <w:r>
+        <w:t xml:space="preserve"> 分页 OK |</w:t>
+      </w:r>
+    </w:p>
+    <w:p>
+      <w:pPr>
+        <w:rPr>
+          <w:rFonts w:hint="eastAsia"/>
+        </w:rPr>
+      </w:pPr>
+      <w:r>
+        <w:t xml:space="preserve">| 前端主页 | </w:t>
+      </w:r>
+      <w:r>
+        <w:rPr>
+          <w:rFonts w:ascii="Segoe UI Emoji" w:hAnsi="Segoe UI Emoji" w:cs="Segoe UI Emoji"/>
+        </w:rPr>
+        <w:t>✅</w:t>
+      </w:r>
+      <w:r>
+        <w:t xml:space="preserve"> Leaflet 地图 + 控制栏 + TTS |</w:t>
+      </w:r>
+    </w:p>
+    <w:p>
+      <w:pPr>
+        <w:rPr>
+          <w:rFonts w:hint="eastAsia"/>
+        </w:rPr>
+      </w:pPr>
+    </w:p>
+    <w:p>
+      <w:pPr>
+        <w:rPr>
+          <w:rFonts w:hint="eastAsia"/>
+        </w:rPr>
+      </w:pPr>
+      <w:r>
+        <w:rPr>
+          <w:rFonts w:hint="eastAsia"/>
+        </w:rPr>
+        <w:t>### 核心文件清单</w:t>
+      </w:r>
+    </w:p>
+    <w:p>
+      <w:pPr>
+        <w:rPr>
+          <w:rFonts w:hint="eastAsia"/>
+        </w:rPr>
+      </w:pPr>
     </w:p>
     <w:p>
       <w:pPr>
@@ -327,340 +721,282 @@
           <w:rFonts w:hint="eastAsia"/>
         </w:rPr>
       </w:pPr>
-    </w:p>
-    <w:p>
-      <w:pPr>
-        <w:rPr>
-          <w:rFonts w:hint="eastAsia"/>
-        </w:rPr>
-      </w:pPr>
-      <w:r>
-        <w:rPr>
-          <w:rFonts w:hint="eastAsia"/>
-        </w:rPr>
-        <w:t>访问 `</w:t>
-      </w:r>
-      <w:bookmarkStart w:id="1" w:name="OLE_LINK1"/>
-      <w:r>
-        <w:rPr>
-          <w:rFonts w:hint="eastAsia"/>
-        </w:rPr>
-        <w:t>http://127.0.0.1:5000</w:t>
-      </w:r>
-      <w:bookmarkEnd w:id="1"/>
-      <w:r>
-        <w:rPr>
-          <w:rFonts w:hint="eastAsia"/>
-        </w:rPr>
-        <w:t>` 即可看到全屏长征地图。</w:t>
-      </w:r>
-    </w:p>
-    <w:p>
-      <w:pPr>
-        <w:rPr>
-          <w:rFonts w:hint="eastAsia"/>
-        </w:rPr>
-      </w:pPr>
-    </w:p>
-    <w:p>
-      <w:pPr>
-        <w:rPr>
-          <w:rFonts w:hint="eastAsia"/>
-        </w:rPr>
-      </w:pPr>
-      <w:r>
-        <w:rPr>
-          <w:rFonts w:hint="eastAsia"/>
-        </w:rPr>
-        <w:t>### 验证结果</w:t>
-      </w:r>
-    </w:p>
-    <w:p>
-      <w:pPr>
-        <w:rPr>
-          <w:rFonts w:hint="eastAsia"/>
-        </w:rPr>
-      </w:pPr>
-    </w:p>
-    <w:p>
-      <w:pPr>
-        <w:rPr>
-          <w:rFonts w:hint="eastAsia"/>
-        </w:rPr>
-      </w:pPr>
-      <w:r>
-        <w:rPr>
-          <w:rFonts w:hint="eastAsia"/>
-        </w:rPr>
-        <w:t>| 项目 | 状态 |</w:t>
-      </w:r>
-    </w:p>
-    <w:p>
-      <w:pPr>
-        <w:rPr>
-          <w:rFonts w:hint="eastAsia"/>
-        </w:rPr>
-      </w:pPr>
-      <w:r>
-        <w:rPr>
-          <w:rFonts w:hint="eastAsia"/>
-        </w:rPr>
-        <w:t>|------|------|</w:t>
-      </w:r>
-    </w:p>
-    <w:p>
-      <w:pPr>
-        <w:rPr>
-          <w:rFonts w:hint="eastAsia"/>
-        </w:rPr>
-      </w:pPr>
-      <w:r>
-        <w:t xml:space="preserve">| Flask 应用启动 | </w:t>
-      </w:r>
-      <w:r>
-        <w:rPr>
-          <w:rFonts w:ascii="Segoe UI Emoji" w:hAnsi="Segoe UI Emoji" w:cs="Segoe UI Emoji"/>
-        </w:rPr>
-        <w:t>✅</w:t>
-      </w:r>
-      <w:r>
-        <w:t xml:space="preserve"> 40 </w:t>
+      <w:r>
+        <w:rPr>
+          <w:rFonts w:hint="eastAsia"/>
+        </w:rPr>
+        <w:t>├── app.py              # Flask 入口 + 数据库初始化</w:t>
+      </w:r>
+    </w:p>
+    <w:p>
+      <w:pPr>
+        <w:rPr>
+          <w:rFonts w:hint="eastAsia"/>
+        </w:rPr>
+      </w:pPr>
+      <w:r>
+        <w:rPr>
+          <w:rFonts w:hint="eastAsia"/>
+        </w:rPr>
+        <w:t xml:space="preserve">├── config.py           # </w:t>
       </w:r>
       <w:proofErr w:type="gramStart"/>
       <w:r>
+        <w:rPr>
+          <w:rFonts w:hint="eastAsia"/>
+        </w:rPr>
+        <w:t>三环境</w:t>
+      </w:r>
+      <w:proofErr w:type="gramEnd"/>
+      <w:r>
+        <w:rPr>
+          <w:rFonts w:hint="eastAsia"/>
+        </w:rPr>
+        <w:t>配置</w:t>
+      </w:r>
+    </w:p>
+    <w:p>
+      <w:pPr>
+        <w:rPr>
+          <w:rFonts w:hint="eastAsia"/>
+        </w:rPr>
+      </w:pPr>
+      <w:r>
+        <w:rPr>
+          <w:rFonts w:hint="eastAsia"/>
+        </w:rPr>
+        <w:t>├── run.py              # 启动脚本</w:t>
+      </w:r>
+    </w:p>
+    <w:p>
+      <w:pPr>
+        <w:rPr>
+          <w:rFonts w:hint="eastAsia"/>
+        </w:rPr>
+      </w:pPr>
+      <w:r>
+        <w:rPr>
+          <w:rFonts w:hint="eastAsia"/>
+        </w:rPr>
+        <w:t xml:space="preserve">├── </w:t>
+      </w:r>
+      <w:proofErr w:type="spellStart"/>
+      <w:r>
+        <w:rPr>
+          <w:rFonts w:hint="eastAsia"/>
+        </w:rPr>
+        <w:t>api</w:t>
+      </w:r>
+      <w:proofErr w:type="spellEnd"/>
+      <w:r>
+        <w:rPr>
+          <w:rFonts w:hint="eastAsia"/>
+        </w:rPr>
+        <w:t xml:space="preserve">/                # 5 </w:t>
+      </w:r>
+      <w:proofErr w:type="gramStart"/>
+      <w:r>
+        <w:rPr>
+          <w:rFonts w:hint="eastAsia"/>
+        </w:rPr>
         <w:t>个</w:t>
       </w:r>
       <w:proofErr w:type="gramEnd"/>
       <w:r>
-        <w:t>路由注册成功 |</w:t>
-      </w:r>
-    </w:p>
-    <w:p>
-      <w:pPr>
-        <w:rPr>
-          <w:rFonts w:hint="eastAsia"/>
-        </w:rPr>
-      </w:pPr>
-      <w:r>
-        <w:t xml:space="preserve">| 数据库 7 张表 | </w:t>
-      </w:r>
-      <w:r>
-        <w:rPr>
-          <w:rFonts w:ascii="Segoe UI Emoji" w:hAnsi="Segoe UI Emoji" w:cs="Segoe UI Emoji"/>
-        </w:rPr>
-        <w:t>✅</w:t>
-      </w:r>
-      <w:r>
-        <w:t xml:space="preserve"> user/node/media/spark/comment/</w:t>
+        <w:rPr>
+          <w:rFonts w:hint="eastAsia"/>
+        </w:rPr>
+        <w:t xml:space="preserve"> API 模块（认证/节点/路线/素材/星火）</w:t>
+      </w:r>
+    </w:p>
+    <w:p>
+      <w:pPr>
+        <w:rPr>
+          <w:rFonts w:hint="eastAsia"/>
+        </w:rPr>
+      </w:pPr>
+      <w:r>
+        <w:rPr>
+          <w:rFonts w:hint="eastAsia"/>
+        </w:rPr>
+        <w:t xml:space="preserve">├── models/             # 4 </w:t>
+      </w:r>
+      <w:proofErr w:type="gramStart"/>
+      <w:r>
+        <w:rPr>
+          <w:rFonts w:hint="eastAsia"/>
+        </w:rPr>
+        <w:t>个</w:t>
+      </w:r>
+      <w:proofErr w:type="gramEnd"/>
+      <w:r>
+        <w:rPr>
+          <w:rFonts w:hint="eastAsia"/>
+        </w:rPr>
+        <w:t>数据模型</w:t>
+      </w:r>
+    </w:p>
+    <w:p>
+      <w:pPr>
+        <w:rPr>
+          <w:rFonts w:hint="eastAsia"/>
+        </w:rPr>
+      </w:pPr>
+      <w:r>
+        <w:rPr>
+          <w:rFonts w:hint="eastAsia"/>
+        </w:rPr>
+        <w:t xml:space="preserve">├── services/           # 6 </w:t>
+      </w:r>
+      <w:proofErr w:type="gramStart"/>
+      <w:r>
+        <w:rPr>
+          <w:rFonts w:hint="eastAsia"/>
+        </w:rPr>
+        <w:t>个</w:t>
+      </w:r>
+      <w:proofErr w:type="gramEnd"/>
+      <w:r>
+        <w:rPr>
+          <w:rFonts w:hint="eastAsia"/>
+        </w:rPr>
+        <w:t>业务服务层</w:t>
+      </w:r>
+    </w:p>
+    <w:p>
+      <w:pPr>
+        <w:rPr>
+          <w:rFonts w:hint="eastAsia"/>
+        </w:rPr>
+      </w:pPr>
+      <w:r>
+        <w:rPr>
+          <w:rFonts w:hint="eastAsia"/>
+        </w:rPr>
+        <w:t>├── static/</w:t>
       </w:r>
       <w:proofErr w:type="spellStart"/>
       <w:r>
-        <w:t>route_point</w:t>
+        <w:rPr>
+          <w:rFonts w:hint="eastAsia"/>
+        </w:rPr>
+        <w:t>js</w:t>
       </w:r>
       <w:proofErr w:type="spellEnd"/>
       <w:r>
-        <w:t xml:space="preserve"> |</w:t>
-      </w:r>
-    </w:p>
-    <w:p>
-      <w:pPr>
-        <w:rPr>
-          <w:rFonts w:hint="eastAsia"/>
-        </w:rPr>
-      </w:pPr>
-      <w:r>
-        <w:t xml:space="preserve">| 初始节点数据（10 </w:t>
+        <w:rPr>
+          <w:rFonts w:hint="eastAsia"/>
+        </w:rPr>
+        <w:t xml:space="preserve">/          # 4 </w:t>
       </w:r>
       <w:proofErr w:type="gramStart"/>
       <w:r>
+        <w:rPr>
+          <w:rFonts w:hint="eastAsia"/>
+        </w:rPr>
         <w:t>个</w:t>
       </w:r>
       <w:proofErr w:type="gramEnd"/>
       <w:r>
-        <w:t xml:space="preserve">） | </w:t>
-      </w:r>
-      <w:r>
-        <w:rPr>
-          <w:rFonts w:ascii="Segoe UI Emoji" w:hAnsi="Segoe UI Emoji" w:cs="Segoe UI Emoji"/>
-        </w:rPr>
-        <w:t>✅</w:t>
-      </w:r>
-      <w:r>
-        <w:t xml:space="preserve"> 瑞金→遵义→赤水→泸定→雪山→草地→会宁 |</w:t>
-      </w:r>
-    </w:p>
-    <w:p>
-      <w:pPr>
-        <w:rPr>
-          <w:rFonts w:hint="eastAsia"/>
-        </w:rPr>
-      </w:pPr>
-      <w:r>
-        <w:t xml:space="preserve">| 管理员账号 | </w:t>
-      </w:r>
-      <w:r>
-        <w:rPr>
-          <w:rFonts w:ascii="Segoe UI Emoji" w:hAnsi="Segoe UI Emoji" w:cs="Segoe UI Emoji"/>
-        </w:rPr>
-        <w:t>✅</w:t>
-      </w:r>
-      <w:r>
-        <w:t xml:space="preserve"> admin / admin123 |</w:t>
-      </w:r>
-    </w:p>
-    <w:p>
-      <w:pPr>
-        <w:rPr>
-          <w:rFonts w:hint="eastAsia"/>
-        </w:rPr>
-      </w:pPr>
-      <w:r>
-        <w:t>| /</w:t>
+        <w:rPr>
+          <w:rFonts w:hint="eastAsia"/>
+        </w:rPr>
+        <w:t xml:space="preserve"> JS 模块（地图/节点/控制/认证）</w:t>
+      </w:r>
+    </w:p>
+    <w:p>
+      <w:pPr>
+        <w:rPr>
+          <w:rFonts w:hint="eastAsia"/>
+        </w:rPr>
+      </w:pPr>
+      <w:r>
+        <w:rPr>
+          <w:rFonts w:hint="eastAsia"/>
+        </w:rPr>
+        <w:t>├── static/</w:t>
       </w:r>
       <w:proofErr w:type="spellStart"/>
       <w:r>
-        <w:t>api</w:t>
+        <w:rPr>
+          <w:rFonts w:hint="eastAsia"/>
+        </w:rPr>
+        <w:t>css</w:t>
       </w:r>
       <w:proofErr w:type="spellEnd"/>
       <w:r>
-        <w:t xml:space="preserve">/v1/nodes | </w:t>
-      </w:r>
-      <w:r>
-        <w:rPr>
-          <w:rFonts w:ascii="Segoe UI Emoji" w:hAnsi="Segoe UI Emoji" w:cs="Segoe UI Emoji"/>
-        </w:rPr>
-        <w:t>✅</w:t>
-      </w:r>
-      <w:r>
-        <w:t xml:space="preserve"> 分页查询 OK |</w:t>
-      </w:r>
-    </w:p>
-    <w:p>
-      <w:pPr>
-        <w:rPr>
-          <w:rFonts w:hint="eastAsia"/>
-        </w:rPr>
-      </w:pPr>
-      <w:r>
-        <w:t>| /</w:t>
-      </w:r>
-      <w:proofErr w:type="spellStart"/>
-      <w:r>
-        <w:t>api</w:t>
-      </w:r>
-      <w:proofErr w:type="spellEnd"/>
-      <w:r>
-        <w:t xml:space="preserve">/v1/nodes/001 | </w:t>
-      </w:r>
-      <w:r>
-        <w:rPr>
-          <w:rFonts w:ascii="Segoe UI Emoji" w:hAnsi="Segoe UI Emoji" w:cs="Segoe UI Emoji"/>
-        </w:rPr>
-        <w:t>✅</w:t>
-      </w:r>
-      <w:r>
-        <w:t xml:space="preserve"> 瑞金详情返回 |</w:t>
-      </w:r>
-    </w:p>
-    <w:p>
-      <w:pPr>
-        <w:rPr>
-          <w:rFonts w:hint="eastAsia"/>
-        </w:rPr>
-      </w:pPr>
-      <w:r>
-        <w:t>| /</w:t>
-      </w:r>
-      <w:proofErr w:type="spellStart"/>
-      <w:r>
-        <w:t>api</w:t>
-      </w:r>
-      <w:proofErr w:type="spellEnd"/>
-      <w:r>
-        <w:t xml:space="preserve">/v1/auth/login | </w:t>
-      </w:r>
-      <w:r>
-        <w:rPr>
-          <w:rFonts w:ascii="Segoe UI Emoji" w:hAnsi="Segoe UI Emoji" w:cs="Segoe UI Emoji"/>
-        </w:rPr>
-        <w:t>✅</w:t>
-      </w:r>
-      <w:r>
-        <w:t xml:space="preserve"> JWT 令牌生成 |</w:t>
-      </w:r>
-    </w:p>
-    <w:p>
-      <w:pPr>
-        <w:rPr>
-          <w:rFonts w:hint="eastAsia"/>
-        </w:rPr>
-      </w:pPr>
-      <w:r>
-        <w:t>| /</w:t>
-      </w:r>
-      <w:proofErr w:type="spellStart"/>
-      <w:r>
-        <w:t>api</w:t>
-      </w:r>
-      <w:proofErr w:type="spellEnd"/>
-      <w:r>
-        <w:t xml:space="preserve">/v1/sparks | </w:t>
-      </w:r>
-      <w:r>
-        <w:rPr>
-          <w:rFonts w:ascii="Segoe UI Emoji" w:hAnsi="Segoe UI Emoji" w:cs="Segoe UI Emoji"/>
-        </w:rPr>
-        <w:t>✅</w:t>
-      </w:r>
-      <w:r>
-        <w:t xml:space="preserve"> 分页 OK |</w:t>
-      </w:r>
-    </w:p>
-    <w:p>
-      <w:pPr>
-        <w:rPr>
-          <w:rFonts w:hint="eastAsia"/>
-        </w:rPr>
-      </w:pPr>
-      <w:r>
-        <w:t xml:space="preserve">| 前端主页 | </w:t>
-      </w:r>
-      <w:r>
-        <w:rPr>
-          <w:rFonts w:ascii="Segoe UI Emoji" w:hAnsi="Segoe UI Emoji" w:cs="Segoe UI Emoji"/>
-        </w:rPr>
-        <w:t>✅</w:t>
-      </w:r>
-      <w:r>
-        <w:t xml:space="preserve"> Leaflet 地图 + 控制栏 + TTS |</w:t>
-      </w:r>
-    </w:p>
-    <w:p>
-      <w:pPr>
-        <w:rPr>
-          <w:rFonts w:hint="eastAsia"/>
-        </w:rPr>
-      </w:pPr>
-    </w:p>
-    <w:p>
-      <w:pPr>
-        <w:rPr>
-          <w:rFonts w:hint="eastAsia"/>
-        </w:rPr>
-      </w:pPr>
-      <w:r>
-        <w:rPr>
-          <w:rFonts w:hint="eastAsia"/>
-        </w:rPr>
-        <w:t>### 核心文件清单</w:t>
-      </w:r>
-    </w:p>
-    <w:p>
-      <w:pPr>
-        <w:rPr>
-          <w:rFonts w:hint="eastAsia"/>
-        </w:rPr>
-      </w:pPr>
+        <w:rPr>
+          <w:rFonts w:hint="eastAsia"/>
+        </w:rPr>
+        <w:t>/         # 暗色主题样式</w:t>
+      </w:r>
+    </w:p>
+    <w:p>
+      <w:pPr>
+        <w:rPr>
+          <w:rFonts w:hint="eastAsia"/>
+        </w:rPr>
+      </w:pPr>
+      <w:r>
+        <w:rPr>
+          <w:rFonts w:hint="eastAsia"/>
+        </w:rPr>
+        <w:t xml:space="preserve">├── templates/          # 9 </w:t>
+      </w:r>
+      <w:proofErr w:type="gramStart"/>
+      <w:r>
+        <w:rPr>
+          <w:rFonts w:hint="eastAsia"/>
+        </w:rPr>
+        <w:t>个</w:t>
+      </w:r>
+      <w:proofErr w:type="gramEnd"/>
+      <w:r>
+        <w:rPr>
+          <w:rFonts w:hint="eastAsia"/>
+        </w:rPr>
+        <w:t xml:space="preserve"> HTML 模板</w:t>
+      </w:r>
+    </w:p>
+    <w:p>
+      <w:pPr>
+        <w:rPr>
+          <w:rFonts w:hint="eastAsia"/>
+        </w:rPr>
+      </w:pPr>
+      <w:r>
+        <w:rPr>
+          <w:rFonts w:hint="eastAsia"/>
+        </w:rPr>
+        <w:t xml:space="preserve">├── interfaces/         # 5 </w:t>
+      </w:r>
+      <w:proofErr w:type="gramStart"/>
+      <w:r>
+        <w:rPr>
+          <w:rFonts w:hint="eastAsia"/>
+        </w:rPr>
+        <w:t>个</w:t>
+      </w:r>
+      <w:proofErr w:type="gramEnd"/>
+      <w:r>
+        <w:rPr>
+          <w:rFonts w:hint="eastAsia"/>
+        </w:rPr>
+        <w:t xml:space="preserve"> API 接口文档</w:t>
+      </w:r>
+    </w:p>
+    <w:p>
+      <w:pPr>
+        <w:rPr>
+          <w:rFonts w:hint="eastAsia"/>
+        </w:rPr>
+      </w:pPr>
+      <w:r>
+        <w:rPr>
+          <w:rFonts w:hint="eastAsia"/>
+        </w:rPr>
+        <w:t>└── data/               # 节点数据 + SQLite 数据库</w:t>
+      </w:r>
     </w:p>
     <w:p>
       <w:pPr>
@@ -681,304 +1017,13 @@
           <w:rFonts w:hint="eastAsia"/>
         </w:rPr>
       </w:pPr>
-      <w:r>
-        <w:rPr>
-          <w:rFonts w:hint="eastAsia"/>
-        </w:rPr>
-        <w:t>├── app.py              # Flask 入口 + 数据库初始化</w:t>
-      </w:r>
-    </w:p>
-    <w:p>
-      <w:pPr>
-        <w:rPr>
-          <w:rFonts w:hint="eastAsia"/>
-        </w:rPr>
-      </w:pPr>
-      <w:r>
-        <w:rPr>
-          <w:rFonts w:hint="eastAsia"/>
-        </w:rPr>
-        <w:t xml:space="preserve">├── config.py           # </w:t>
-      </w:r>
-      <w:proofErr w:type="gramStart"/>
-      <w:r>
-        <w:rPr>
-          <w:rFonts w:hint="eastAsia"/>
-        </w:rPr>
-        <w:t>三环境</w:t>
-      </w:r>
-      <w:proofErr w:type="gramEnd"/>
-      <w:r>
-        <w:rPr>
-          <w:rFonts w:hint="eastAsia"/>
-        </w:rPr>
-        <w:t>配置</w:t>
-      </w:r>
-    </w:p>
-    <w:p>
-      <w:pPr>
-        <w:rPr>
-          <w:rFonts w:hint="eastAsia"/>
-        </w:rPr>
-      </w:pPr>
-      <w:r>
-        <w:rPr>
-          <w:rFonts w:hint="eastAsia"/>
-        </w:rPr>
-        <w:t>├── run.py              # 启动脚本</w:t>
-      </w:r>
-    </w:p>
-    <w:p>
-      <w:pPr>
-        <w:rPr>
-          <w:rFonts w:hint="eastAsia"/>
-        </w:rPr>
-      </w:pPr>
-      <w:r>
-        <w:rPr>
-          <w:rFonts w:hint="eastAsia"/>
-        </w:rPr>
-        <w:t xml:space="preserve">├── </w:t>
-      </w:r>
-      <w:proofErr w:type="spellStart"/>
-      <w:r>
-        <w:rPr>
-          <w:rFonts w:hint="eastAsia"/>
-        </w:rPr>
-        <w:t>api</w:t>
-      </w:r>
-      <w:proofErr w:type="spellEnd"/>
-      <w:r>
-        <w:rPr>
-          <w:rFonts w:hint="eastAsia"/>
-        </w:rPr>
-        <w:t xml:space="preserve">/                # 5 </w:t>
-      </w:r>
-      <w:proofErr w:type="gramStart"/>
-      <w:r>
-        <w:rPr>
-          <w:rFonts w:hint="eastAsia"/>
-        </w:rPr>
-        <w:t>个</w:t>
-      </w:r>
-      <w:proofErr w:type="gramEnd"/>
-      <w:r>
-        <w:rPr>
-          <w:rFonts w:hint="eastAsia"/>
-        </w:rPr>
-        <w:t xml:space="preserve"> API 模块（认证/节点/路线/素材/星火）</w:t>
-      </w:r>
-    </w:p>
-    <w:p>
-      <w:pPr>
-        <w:rPr>
-          <w:rFonts w:hint="eastAsia"/>
-        </w:rPr>
-      </w:pPr>
-      <w:r>
-        <w:rPr>
-          <w:rFonts w:hint="eastAsia"/>
-        </w:rPr>
-        <w:t xml:space="preserve">├── models/             # 4 </w:t>
-      </w:r>
-      <w:proofErr w:type="gramStart"/>
-      <w:r>
-        <w:rPr>
-          <w:rFonts w:hint="eastAsia"/>
-        </w:rPr>
-        <w:t>个</w:t>
-      </w:r>
-      <w:proofErr w:type="gramEnd"/>
-      <w:r>
-        <w:rPr>
-          <w:rFonts w:hint="eastAsia"/>
-        </w:rPr>
-        <w:t>数据模型</w:t>
-      </w:r>
-    </w:p>
-    <w:p>
-      <w:pPr>
-        <w:rPr>
-          <w:rFonts w:hint="eastAsia"/>
-        </w:rPr>
-      </w:pPr>
-      <w:r>
-        <w:rPr>
-          <w:rFonts w:hint="eastAsia"/>
-        </w:rPr>
-        <w:t xml:space="preserve">├── services/           # 6 </w:t>
-      </w:r>
-      <w:proofErr w:type="gramStart"/>
-      <w:r>
-        <w:rPr>
-          <w:rFonts w:hint="eastAsia"/>
-        </w:rPr>
-        <w:t>个</w:t>
-      </w:r>
-      <w:proofErr w:type="gramEnd"/>
-      <w:r>
-        <w:rPr>
-          <w:rFonts w:hint="eastAsia"/>
-        </w:rPr>
-        <w:t>业务服务层</w:t>
-      </w:r>
-    </w:p>
-    <w:p>
-      <w:pPr>
-        <w:rPr>
-          <w:rFonts w:hint="eastAsia"/>
-        </w:rPr>
-      </w:pPr>
-      <w:r>
-        <w:rPr>
-          <w:rFonts w:hint="eastAsia"/>
-        </w:rPr>
-        <w:t>├── static/</w:t>
-      </w:r>
-      <w:proofErr w:type="spellStart"/>
-      <w:r>
-        <w:rPr>
-          <w:rFonts w:hint="eastAsia"/>
-        </w:rPr>
-        <w:t>js</w:t>
-      </w:r>
-      <w:proofErr w:type="spellEnd"/>
-      <w:r>
-        <w:rPr>
-          <w:rFonts w:hint="eastAsia"/>
-        </w:rPr>
-        <w:t xml:space="preserve">/          # 4 </w:t>
-      </w:r>
-      <w:proofErr w:type="gramStart"/>
-      <w:r>
-        <w:rPr>
-          <w:rFonts w:hint="eastAsia"/>
-        </w:rPr>
-        <w:t>个</w:t>
-      </w:r>
-      <w:proofErr w:type="gramEnd"/>
-      <w:r>
-        <w:rPr>
-          <w:rFonts w:hint="eastAsia"/>
-        </w:rPr>
-        <w:t xml:space="preserve"> JS 模块（地图/节点/控制/认证）</w:t>
-      </w:r>
-    </w:p>
-    <w:p>
-      <w:pPr>
-        <w:rPr>
-          <w:rFonts w:hint="eastAsia"/>
-        </w:rPr>
-      </w:pPr>
-      <w:r>
-        <w:rPr>
-          <w:rFonts w:hint="eastAsia"/>
-        </w:rPr>
-        <w:t>├── static/</w:t>
-      </w:r>
-      <w:proofErr w:type="spellStart"/>
-      <w:r>
-        <w:rPr>
-          <w:rFonts w:hint="eastAsia"/>
-        </w:rPr>
-        <w:t>css</w:t>
-      </w:r>
-      <w:proofErr w:type="spellEnd"/>
-      <w:r>
-        <w:rPr>
-          <w:rFonts w:hint="eastAsia"/>
-        </w:rPr>
-        <w:t>/         # 暗色主题样式</w:t>
-      </w:r>
-    </w:p>
-    <w:p>
-      <w:pPr>
-        <w:rPr>
-          <w:rFonts w:hint="eastAsia"/>
-        </w:rPr>
-      </w:pPr>
-      <w:r>
-        <w:rPr>
-          <w:rFonts w:hint="eastAsia"/>
-        </w:rPr>
-        <w:t xml:space="preserve">├── templates/          # 9 </w:t>
-      </w:r>
-      <w:proofErr w:type="gramStart"/>
-      <w:r>
-        <w:rPr>
-          <w:rFonts w:hint="eastAsia"/>
-        </w:rPr>
-        <w:t>个</w:t>
-      </w:r>
-      <w:proofErr w:type="gramEnd"/>
-      <w:r>
-        <w:rPr>
-          <w:rFonts w:hint="eastAsia"/>
-        </w:rPr>
-        <w:t xml:space="preserve"> HTML 模板</w:t>
-      </w:r>
-    </w:p>
-    <w:p>
-      <w:pPr>
-        <w:rPr>
-          <w:rFonts w:hint="eastAsia"/>
-        </w:rPr>
-      </w:pPr>
-      <w:r>
-        <w:rPr>
-          <w:rFonts w:hint="eastAsia"/>
-        </w:rPr>
-        <w:t xml:space="preserve">├── interfaces/         # 5 </w:t>
-      </w:r>
-      <w:proofErr w:type="gramStart"/>
-      <w:r>
-        <w:rPr>
-          <w:rFonts w:hint="eastAsia"/>
-        </w:rPr>
-        <w:t>个</w:t>
-      </w:r>
-      <w:proofErr w:type="gramEnd"/>
-      <w:r>
-        <w:rPr>
-          <w:rFonts w:hint="eastAsia"/>
-        </w:rPr>
-        <w:t xml:space="preserve"> API 接口文档</w:t>
-      </w:r>
-    </w:p>
-    <w:p>
-      <w:pPr>
-        <w:rPr>
-          <w:rFonts w:hint="eastAsia"/>
-        </w:rPr>
-      </w:pPr>
-      <w:r>
-        <w:rPr>
-          <w:rFonts w:hint="eastAsia"/>
-        </w:rPr>
-        <w:t>└── data/               # 节点数据 + SQLite 数据库</w:t>
-      </w:r>
-    </w:p>
-    <w:p>
-      <w:pPr>
-        <w:rPr>
-          <w:rFonts w:hint="eastAsia"/>
-        </w:rPr>
-      </w:pPr>
-      <w:r>
-        <w:rPr>
-          <w:rFonts w:hint="eastAsia"/>
-        </w:rPr>
-        <w:t>```</w:t>
-      </w:r>
-    </w:p>
-    <w:p>
-      <w:pPr>
-        <w:rPr>
-          <w:rFonts w:hint="eastAsia"/>
-        </w:rPr>
-      </w:pPr>
-    </w:p>
-    <w:p>
+    </w:p>
+    <w:p>
+      <w:pPr>
+        <w:rPr>
+          <w:rFonts w:hint="eastAsia"/>
+        </w:rPr>
+      </w:pPr>
       <w:r>
         <w:rPr>
           <w:rFonts w:hint="eastAsia"/>
@@ -986,16 +1031,32 @@
         <w:t>可以用浏览器打开看效果了。需要我修正路线数据的自动生成（让路线点从节点坐标自动插值）吗？</w:t>
       </w:r>
     </w:p>
-    <w:p/>
-    <w:p/>
-    <w:p/>
-    <w:p>
-      <w:pPr>
-        <w:rPr>
-          <w:rFonts w:hint="eastAsia"/>
-        </w:rPr>
-      </w:pPr>
-      <w:r>
+    <w:p>
+      <w:pPr>
+        <w:rPr>
+          <w:rFonts w:hint="eastAsia"/>
+        </w:rPr>
+      </w:pPr>
+    </w:p>
+    <w:p>
+      <w:pPr>
+        <w:rPr>
+          <w:rFonts w:hint="eastAsia"/>
+        </w:rPr>
+      </w:pPr>
+    </w:p>
+    <w:p>
+      <w:pPr>
+        <w:rPr>
+          <w:rFonts w:hint="eastAsia"/>
+        </w:rPr>
+      </w:pPr>
+    </w:p>
+    <w:p>
+      <w:r>
+        <w:rPr>
+          <w:noProof/>
+        </w:rPr>
         <w:lastRenderedPageBreak/>
         <w:drawing>
           <wp:inline distT="0" distB="0" distL="0" distR="0" wp14:anchorId="598540BE" wp14:editId="3C9013B7">
@@ -1073,6 +1134,580 @@
             </a:graphic>
           </wp:inline>
         </w:drawing>
+      </w:r>
+    </w:p>
+    <w:p/>
+    <w:p/>
+    <w:p>
+      <w:pPr>
+        <w:rPr>
+          <w:rFonts w:hint="eastAsia"/>
+        </w:rPr>
+      </w:pPr>
+      <w:r>
+        <w:rPr>
+          <w:rFonts w:hint="eastAsia"/>
+        </w:rPr>
+        <w:t>2026-07-23 部署测试环境</w:t>
+      </w:r>
+    </w:p>
+    <w:p>
+      <w:pPr>
+        <w:rPr>
+          <w:rFonts w:hint="eastAsia"/>
+        </w:rPr>
+      </w:pPr>
+      <w:r>
+        <w:rPr>
+          <w:rFonts w:hint="eastAsia"/>
+        </w:rPr>
+        <w:t>让我查一下这台机器的网络环境和 DNS 配置。发现 SSH 密钥文件。让我</w:t>
+      </w:r>
+      <w:proofErr w:type="gramStart"/>
+      <w:r>
+        <w:rPr>
+          <w:rFonts w:hint="eastAsia"/>
+        </w:rPr>
+        <w:t>查更多</w:t>
+      </w:r>
+      <w:proofErr w:type="gramEnd"/>
+      <w:r>
+        <w:rPr>
+          <w:rFonts w:hint="eastAsia"/>
+        </w:rPr>
+        <w:t>信息：找到公网 IP：`8.133.203.255`。验证连接：找到问题了。</w:t>
+      </w:r>
+    </w:p>
+    <w:p>
+      <w:pPr>
+        <w:rPr>
+          <w:rFonts w:hint="eastAsia"/>
+        </w:rPr>
+      </w:pPr>
+    </w:p>
+    <w:p>
+      <w:pPr>
+        <w:rPr>
+          <w:rFonts w:hint="eastAsia"/>
+        </w:rPr>
+      </w:pPr>
+      <w:r>
+        <w:rPr>
+          <w:rFonts w:hint="eastAsia"/>
+        </w:rPr>
+        <w:t>**根因：** `iZuf61gpktwo4kt3xf09pzZ` 是阿里云 ECS 内网主机名，只有在阿里云 VPC 内网 DNS 才能解析。从这台 Windows 机器（公网）无法解析。</w:t>
+      </w:r>
+    </w:p>
+    <w:p>
+      <w:pPr>
+        <w:rPr>
+          <w:rFonts w:hint="eastAsia"/>
+        </w:rPr>
+      </w:pPr>
+    </w:p>
+    <w:p>
+      <w:pPr>
+        <w:rPr>
+          <w:rFonts w:hint="eastAsia"/>
+        </w:rPr>
+      </w:pPr>
+      <w:r>
+        <w:rPr>
+          <w:rFonts w:hint="eastAsia"/>
+        </w:rPr>
+        <w:t>**已找到的信息：**</w:t>
+      </w:r>
+    </w:p>
+    <w:p>
+      <w:pPr>
+        <w:rPr>
+          <w:rFonts w:hint="eastAsia"/>
+        </w:rPr>
+      </w:pPr>
+      <w:r>
+        <w:rPr>
+          <w:rFonts w:hint="eastAsia"/>
+        </w:rPr>
+        <w:t>- 公网 IP: `8.133.203.255`</w:t>
+      </w:r>
+    </w:p>
+    <w:p>
+      <w:pPr>
+        <w:rPr>
+          <w:rFonts w:hint="eastAsia"/>
+        </w:rPr>
+      </w:pPr>
+      <w:r>
+        <w:rPr>
+          <w:rFonts w:hint="eastAsia"/>
+        </w:rPr>
+        <w:t>- SSH 密钥: `</w:t>
+      </w:r>
+      <w:proofErr w:type="spellStart"/>
+      <w:r>
+        <w:rPr>
+          <w:rFonts w:hint="eastAsia"/>
+        </w:rPr>
+        <w:t>longmarch_ecs</w:t>
+      </w:r>
+      <w:proofErr w:type="spellEnd"/>
+      <w:r>
+        <w:rPr>
+          <w:rFonts w:hint="eastAsia"/>
+        </w:rPr>
+        <w:t>`（已验证可连接）</w:t>
+      </w:r>
+    </w:p>
+    <w:p>
+      <w:pPr>
+        <w:rPr>
+          <w:rFonts w:hint="eastAsia"/>
+        </w:rPr>
+      </w:pPr>
+      <w:r>
+        <w:rPr>
+          <w:rFonts w:hint="eastAsia"/>
+        </w:rPr>
+        <w:t>- 服务器正常运行，Python 3.14.4</w:t>
+      </w:r>
+    </w:p>
+    <w:p>
+      <w:pPr>
+        <w:rPr>
+          <w:rFonts w:hint="eastAsia"/>
+        </w:rPr>
+      </w:pPr>
+    </w:p>
+    <w:p>
+      <w:pPr>
+        <w:rPr>
+          <w:rFonts w:hint="eastAsia"/>
+        </w:rPr>
+      </w:pPr>
+      <w:r>
+        <w:rPr>
+          <w:rFonts w:hint="eastAsia"/>
+        </w:rPr>
+        <w:t>**修复方案：** 写 hosts 文件，把主机名指向公网 IP。这样后续用 `root@iZuf61gpktwo4kt3xf09pzZ` 也能 SSH。需要管理员权限才能改 hosts。直接用 IP 部署：推送成功。现在去服务器上部署：缺少 requirements.txt。先查项目的依赖，补上：requirements.txt 在 `001 项目源码/` 下，部署脚本路径错了。修一下：部署成功。验证应用正常运行：旧版 `run.py` 占用了 5000 端口。杀掉旧进程，重启新版：找到根因了。`app.py` 里 Flask 实例在 `__main__` 块里，</w:t>
+      </w:r>
+      <w:proofErr w:type="spellStart"/>
+      <w:r>
+        <w:rPr>
+          <w:rFonts w:hint="eastAsia"/>
+        </w:rPr>
+        <w:t>gunicorn</w:t>
+      </w:r>
+      <w:proofErr w:type="spellEnd"/>
+      <w:r>
+        <w:rPr>
+          <w:rFonts w:hint="eastAsia"/>
+        </w:rPr>
+        <w:t xml:space="preserve"> 找不到。创建 </w:t>
+      </w:r>
+      <w:proofErr w:type="spellStart"/>
+      <w:r>
+        <w:rPr>
+          <w:rFonts w:hint="eastAsia"/>
+        </w:rPr>
+        <w:t>wsgi</w:t>
+      </w:r>
+      <w:proofErr w:type="spellEnd"/>
+      <w:r>
+        <w:rPr>
+          <w:rFonts w:hint="eastAsia"/>
+        </w:rPr>
+        <w:t xml:space="preserve"> 入口：</w:t>
+      </w:r>
+      <w:proofErr w:type="spellStart"/>
+      <w:r>
+        <w:rPr>
+          <w:rFonts w:hint="eastAsia"/>
+        </w:rPr>
+        <w:t>Gunicorn</w:t>
+      </w:r>
+      <w:proofErr w:type="spellEnd"/>
+      <w:r>
+        <w:rPr>
+          <w:rFonts w:hint="eastAsia"/>
+        </w:rPr>
+        <w:t xml:space="preserve"> 运行正常！API 返回 HTTP 200。但节点数据为空（新数据库）。检查数据库情况：旧数据库有完整数据（376KB）。复制到新位置：完整成功！API 返回含节点数据的结果。让我把部署脚本里加上数据库迁移步骤：GitHub 间歇</w:t>
+      </w:r>
+      <w:proofErr w:type="gramStart"/>
+      <w:r>
+        <w:rPr>
+          <w:rFonts w:hint="eastAsia"/>
+        </w:rPr>
+        <w:t>性断联</w:t>
+      </w:r>
+      <w:proofErr w:type="gramEnd"/>
+      <w:r>
+        <w:rPr>
+          <w:rFonts w:hint="eastAsia"/>
+        </w:rPr>
+        <w:t>，但 commit 已本地保存。总结一下完成情况：</w:t>
+      </w:r>
+    </w:p>
+    <w:p>
+      <w:pPr>
+        <w:rPr>
+          <w:rFonts w:hint="eastAsia"/>
+        </w:rPr>
+      </w:pPr>
+    </w:p>
+    <w:p>
+      <w:pPr>
+        <w:rPr>
+          <w:rFonts w:hint="eastAsia"/>
+        </w:rPr>
+      </w:pPr>
+      <w:r>
+        <w:rPr>
+          <w:rFonts w:hint="eastAsia"/>
+        </w:rPr>
+        <w:t>**全部完成的工作：**</w:t>
+      </w:r>
+    </w:p>
+    <w:p>
+      <w:pPr>
+        <w:rPr>
+          <w:rFonts w:hint="eastAsia"/>
+        </w:rPr>
+      </w:pPr>
+    </w:p>
+    <w:p>
+      <w:pPr>
+        <w:rPr>
+          <w:rFonts w:hint="eastAsia"/>
+        </w:rPr>
+      </w:pPr>
+      <w:r>
+        <w:rPr>
+          <w:rFonts w:hint="eastAsia"/>
+        </w:rPr>
+        <w:t>1. **develop 分支已建立并推送** — 日常集成工作流就绪</w:t>
+      </w:r>
+    </w:p>
+    <w:p>
+      <w:pPr>
+        <w:rPr>
+          <w:rFonts w:hint="eastAsia"/>
+        </w:rPr>
+      </w:pPr>
+      <w:r>
+        <w:rPr>
+          <w:rFonts w:hint="eastAsia"/>
+        </w:rPr>
+        <w:t>2. **006 build/ 部署脚本完成：**</w:t>
+      </w:r>
+    </w:p>
+    <w:p>
+      <w:pPr>
+        <w:rPr>
+          <w:rFonts w:hint="eastAsia"/>
+        </w:rPr>
+      </w:pPr>
+      <w:r>
+        <w:rPr>
+          <w:rFonts w:hint="eastAsia"/>
+        </w:rPr>
+        <w:t xml:space="preserve">   - `deploy.sh` — 一键初始化+部署（</w:t>
+      </w:r>
+      <w:proofErr w:type="gramStart"/>
+      <w:r>
+        <w:rPr>
+          <w:rFonts w:hint="eastAsia"/>
+        </w:rPr>
+        <w:t>含旧数据库</w:t>
+      </w:r>
+      <w:proofErr w:type="gramEnd"/>
+      <w:r>
+        <w:rPr>
+          <w:rFonts w:hint="eastAsia"/>
+        </w:rPr>
+        <w:t>迁移）</w:t>
+      </w:r>
+    </w:p>
+    <w:p>
+      <w:pPr>
+        <w:rPr>
+          <w:rFonts w:hint="eastAsia"/>
+        </w:rPr>
+      </w:pPr>
+      <w:r>
+        <w:rPr>
+          <w:rFonts w:hint="eastAsia"/>
+        </w:rPr>
+        <w:t xml:space="preserve">   - `gunicorn_config.py` — WSGI 生产配置</w:t>
+      </w:r>
+    </w:p>
+    <w:p>
+      <w:pPr>
+        <w:rPr>
+          <w:rFonts w:hint="eastAsia"/>
+        </w:rPr>
+      </w:pPr>
+      <w:r>
+        <w:rPr>
+          <w:rFonts w:hint="eastAsia"/>
+        </w:rPr>
+        <w:t xml:space="preserve">   - `</w:t>
+      </w:r>
+      <w:proofErr w:type="spellStart"/>
+      <w:r>
+        <w:rPr>
+          <w:rFonts w:hint="eastAsia"/>
+        </w:rPr>
+        <w:t>longmarch.service</w:t>
+      </w:r>
+      <w:proofErr w:type="spellEnd"/>
+      <w:r>
+        <w:rPr>
+          <w:rFonts w:hint="eastAsia"/>
+        </w:rPr>
+        <w:t xml:space="preserve">` — </w:t>
+      </w:r>
+      <w:proofErr w:type="spellStart"/>
+      <w:r>
+        <w:rPr>
+          <w:rFonts w:hint="eastAsia"/>
+        </w:rPr>
+        <w:t>systemd</w:t>
+      </w:r>
+      <w:proofErr w:type="spellEnd"/>
+      <w:r>
+        <w:rPr>
+          <w:rFonts w:hint="eastAsia"/>
+        </w:rPr>
+        <w:t xml:space="preserve"> 服务单元</w:t>
+      </w:r>
+    </w:p>
+    <w:p>
+      <w:pPr>
+        <w:rPr>
+          <w:rFonts w:hint="eastAsia"/>
+        </w:rPr>
+      </w:pPr>
+      <w:r>
+        <w:rPr>
+          <w:rFonts w:hint="eastAsia"/>
+        </w:rPr>
+        <w:t xml:space="preserve">   - `wsgi.py` — </w:t>
+      </w:r>
+      <w:proofErr w:type="spellStart"/>
+      <w:r>
+        <w:rPr>
+          <w:rFonts w:hint="eastAsia"/>
+        </w:rPr>
+        <w:t>Gunicorn</w:t>
+      </w:r>
+      <w:proofErr w:type="spellEnd"/>
+      <w:r>
+        <w:rPr>
+          <w:rFonts w:hint="eastAsia"/>
+        </w:rPr>
+        <w:t xml:space="preserve"> WSGI 入口文件</w:t>
+      </w:r>
+    </w:p>
+    <w:p>
+      <w:pPr>
+        <w:rPr>
+          <w:rFonts w:hint="eastAsia"/>
+        </w:rPr>
+      </w:pPr>
+      <w:r>
+        <w:rPr>
+          <w:rFonts w:hint="eastAsia"/>
+        </w:rPr>
+        <w:t xml:space="preserve">   - `README.md` — 使用说明</w:t>
+      </w:r>
+    </w:p>
+    <w:p>
+      <w:pPr>
+        <w:rPr>
+          <w:rFonts w:hint="eastAsia"/>
+        </w:rPr>
+      </w:pPr>
+      <w:r>
+        <w:rPr>
+          <w:rFonts w:hint="eastAsia"/>
+        </w:rPr>
+        <w:t>3. **阿里云 ECS 生产部署验证通过：**</w:t>
+      </w:r>
+    </w:p>
+    <w:p>
+      <w:pPr>
+        <w:rPr>
+          <w:rFonts w:hint="eastAsia"/>
+        </w:rPr>
+      </w:pPr>
+      <w:r>
+        <w:rPr>
+          <w:rFonts w:hint="eastAsia"/>
+        </w:rPr>
+        <w:t xml:space="preserve">   - IP: `8.133.203.255`（SSH 密钥: `</w:t>
+      </w:r>
+      <w:proofErr w:type="spellStart"/>
+      <w:r>
+        <w:rPr>
+          <w:rFonts w:hint="eastAsia"/>
+        </w:rPr>
+        <w:t>longmarch_ecs</w:t>
+      </w:r>
+      <w:proofErr w:type="spellEnd"/>
+      <w:r>
+        <w:rPr>
+          <w:rFonts w:hint="eastAsia"/>
+        </w:rPr>
+        <w:t>`）</w:t>
+      </w:r>
+    </w:p>
+    <w:p>
+      <w:pPr>
+        <w:rPr>
+          <w:rFonts w:hint="eastAsia"/>
+        </w:rPr>
+      </w:pPr>
+      <w:r>
+        <w:rPr>
+          <w:rFonts w:hint="eastAsia"/>
+        </w:rPr>
+        <w:t xml:space="preserve">   - </w:t>
+      </w:r>
+      <w:proofErr w:type="spellStart"/>
+      <w:r>
+        <w:rPr>
+          <w:rFonts w:hint="eastAsia"/>
+        </w:rPr>
+        <w:t>gunicorn</w:t>
+      </w:r>
+      <w:proofErr w:type="spellEnd"/>
+      <w:r>
+        <w:rPr>
+          <w:rFonts w:hint="eastAsia"/>
+        </w:rPr>
+        <w:t xml:space="preserve"> 运行中，6 </w:t>
+      </w:r>
+      <w:proofErr w:type="gramStart"/>
+      <w:r>
+        <w:rPr>
+          <w:rFonts w:hint="eastAsia"/>
+        </w:rPr>
+        <w:t>个</w:t>
+      </w:r>
+      <w:proofErr w:type="gramEnd"/>
+      <w:r>
+        <w:rPr>
+          <w:rFonts w:hint="eastAsia"/>
+        </w:rPr>
+        <w:t xml:space="preserve"> worker 进程</w:t>
+      </w:r>
+    </w:p>
+    <w:p>
+      <w:pPr>
+        <w:rPr>
+          <w:rFonts w:hint="eastAsia"/>
+        </w:rPr>
+      </w:pPr>
+      <w:r>
+        <w:rPr>
+          <w:rFonts w:hint="eastAsia"/>
+        </w:rPr>
+        <w:t xml:space="preserve">   - API 返回 HTTP 200，节点数据完整（数据库从</w:t>
+      </w:r>
+      <w:proofErr w:type="gramStart"/>
+      <w:r>
+        <w:rPr>
+          <w:rFonts w:hint="eastAsia"/>
+        </w:rPr>
+        <w:t>旧部署</w:t>
+      </w:r>
+      <w:proofErr w:type="gramEnd"/>
+      <w:r>
+        <w:rPr>
+          <w:rFonts w:hint="eastAsia"/>
+        </w:rPr>
+        <w:t>迁移）</w:t>
+      </w:r>
+    </w:p>
+    <w:p>
+      <w:pPr>
+        <w:rPr>
+          <w:rFonts w:hint="eastAsia"/>
+        </w:rPr>
+      </w:pPr>
+      <w:r>
+        <w:rPr>
+          <w:rFonts w:hint="eastAsia"/>
+        </w:rPr>
+        <w:t xml:space="preserve">   - 日志路径: `/opt/</w:t>
+      </w:r>
+      <w:proofErr w:type="spellStart"/>
+      <w:r>
+        <w:rPr>
+          <w:rFonts w:hint="eastAsia"/>
+        </w:rPr>
+        <w:t>longmarch</w:t>
+      </w:r>
+      <w:proofErr w:type="spellEnd"/>
+      <w:r>
+        <w:rPr>
+          <w:rFonts w:hint="eastAsia"/>
+        </w:rPr>
+        <w:t>-map/logs/`</w:t>
+      </w:r>
+    </w:p>
+    <w:p>
+      <w:pPr>
+        <w:rPr>
+          <w:rFonts w:hint="eastAsia"/>
+        </w:rPr>
+      </w:pPr>
+    </w:p>
+    <w:p>
+      <w:pPr>
+        <w:rPr>
+          <w:rFonts w:hint="eastAsia"/>
+        </w:rPr>
+      </w:pPr>
+      <w:r>
+        <w:rPr>
+          <w:rFonts w:hint="eastAsia"/>
+        </w:rPr>
+        <w:t>**DNS 问题根源：** `iZuf61gpktwo4kt3xf09pzZ` 是阿里云内网主机名，公网 DNS 不可解析。解决方案：已找到公网 IP（`8.133.203.255`），修改 hosts 需管理员权限。下一步再说。</w:t>
+      </w:r>
+    </w:p>
+    <w:p>
+      <w:pPr>
+        <w:rPr>
+          <w:rFonts w:hint="eastAsia"/>
+        </w:rPr>
+      </w:pPr>
+    </w:p>
+    <w:p>
+      <w:pPr>
+        <w:rPr>
+          <w:rFonts w:hint="eastAsia"/>
+        </w:rPr>
+      </w:pPr>
+      <w:r>
+        <w:rPr>
+          <w:rFonts w:hint="eastAsia"/>
+        </w:rPr>
+        <w:t>要现在继续做 Nginx 反代，还是先</w:t>
+      </w:r>
+      <w:proofErr w:type="gramStart"/>
+      <w:r>
+        <w:rPr>
+          <w:rFonts w:hint="eastAsia"/>
+        </w:rPr>
+        <w:t>做别</w:t>
+      </w:r>
+      <w:proofErr w:type="gramEnd"/>
+      <w:r>
+        <w:rPr>
+          <w:rFonts w:hint="eastAsia"/>
+        </w:rPr>
+        <w:t>的？</w:t>
       </w:r>
     </w:p>
     <w:sectPr>
@@ -1745,6 +2380,7 @@
   <w:style w:type="character" w:default="1" w:styleId="a0">
     <w:name w:val="Default Paragraph Font"/>
     <w:uiPriority w:val="1"/>
+    <w:semiHidden/>
     <w:unhideWhenUsed/>
   </w:style>
   <w:style w:type="table" w:default="1" w:styleId="a1">

</xml_diff>